<commit_message>
draft: Buying a home in Katy TX — neighborhood and mortgage guide
</commit_message>
<xml_diff>
--- a/_drafts/2026-06-22_buying-a-home-in-katy-tx-neighborhood-and-mortgage-guide/review.docx
+++ b/_drafts/2026-06-22_buying-a-home-in-katy-tx-neighborhood-and-mortgage-guide/review.docx
@@ -56,19 +56,22 @@
         <w:spacing w:after="240"/>
       </w:pPr>
       <w:r>
-        <w:t>Did you know Katy's home prices have jumped over twenty percent in just three years? It's wild. I'm Tyler Henschel, Senior Loan Officer at CMG Home Loans, and I help buyers navigate this market every single day.</w:t>
+        <w:t>Here's something most people don't realize: the neighborhood you choose in Katy can affect your mortgage options just as much as your credit score.</w:t>
         <w:br/>
         <w:br/>
-        <w:t>If you're thinking about buying in Katy, here's what matters most. First, understand the neighborhoods. Katy's got pockets—some are family-focused with great schools, others are more upscale or just emerging. Know which vibe fits your lifestyle.</w:t>
+        <w:t>I'm Tyler Henschel, Senior Loan Officer at CMG Home Loans, and I've helped hundreds of buyers navigate this market.</w:t>
         <w:br/>
         <w:br/>
-        <w:t>Second, get your financing sorted early. I see buyers fall in love with homes, then discover they're not actually approved. Don't be that person. Let's talk through your options before you start house hunting.</w:t>
+        <w:t>First, Katy's got incredible diversity. You've got established neighborhoods with strong appreciation, newer communities with modern amenities, and everything in between. That matters because lenders look at area trends.</w:t>
         <w:br/>
         <w:br/>
-        <w:t>Third, work with a lender who knows this market. Interest rates and loan programs change constantly, and what works for your neighbor might not work for you.</w:t>
+        <w:t>Second, your down payment flexibility changes based on the home and neighborhood. Some areas support easier financing than others, and I can walk you through what makes sense for your situation.</w:t>
         <w:br/>
         <w:br/>
-        <w:t>Ready to get serious about buying in Katy? Let's hop on a quick call. Head to calendly.com/thenschel-cmghomeloans/30min or visit tylerhloans.com. I'm here to help.</w:t>
+        <w:t>Third, getting pre-qualified early gives you real clarity on what you can actually afford here. No surprises when you find that perfect home.</w:t>
+        <w:br/>
+        <w:br/>
+        <w:t>If you're serious about buying in Katy, let's connect. Head to tylerhloans.com or book a quick call at calendly.com/thenschel-cmghomeloans/30min. I'm here to make this simple.</w:t>
       </w:r>
     </w:p>
     <w:p/>
@@ -85,17 +88,17 @@
         <w:pStyle w:val="Heading2"/>
       </w:pPr>
       <w:r>
-        <w:t>Buying a Home in the Houston Metro: Your Neighborhood &amp; Mortgage Guide</w:t>
+        <w:t>Buying a Home in the Houston Metro Area: A Neighborhood and Mortgage Guide</w:t>
       </w:r>
     </w:p>
     <w:p>
       <w:r>
-        <w:t>The Houston metropolitan area is one of the most dynamic housing markets in the United States. Whether you're looking at the tree-lined streets of The Woodlands, the master-planned communities of Sugar Land, the established charm of Bellaire, or the suburban appeal of Tomball and Cypress, finding the right home is just half the battle. Understanding your financing options and the neighborhoods themselves will set you up for success.</w:t>
+        <w:t>The Greater Houston area is one of the most dynamic real estate markets in Texas. Whether you're drawn to the energy corridor of Sugar Land, the suburban charm of The Woodlands, the growing community of Cypress, or any of the other vibrant neighborhoods across this sprawling metro area, the journey to homeownership requires thoughtful planning—both in choosing the right neighborhood and securing the right mortgage.</w:t>
       </w:r>
     </w:p>
     <w:p>
       <w:r>
-        <w:t>In this guide, we'll walk through what makes different Houston-area neighborhoods unique, key considerations when buying, and how to navigate the mortgage landscape with confidence.</w:t>
+        <w:t>In this guide, we'll walk through how to evaluate Houston-area neighborhoods and explain the mortgage options available to you. If you're ready to take the next step, Tyler Henschel, a Senior Loan Officer at CMG Home Loans, serves homebuyers across the entire Houston metropolitan statistical area and can help you understand your financing options.</w:t>
       </w:r>
     </w:p>
     <w:p>
@@ -103,12 +106,20 @@
         <w:pStyle w:val="Heading2"/>
       </w:pPr>
       <w:r>
-        <w:t>Why the Houston Metro Matters for Homebuyers</w:t>
+        <w:t>Understanding Houston Metro Neighborhoods</w:t>
+      </w:r>
+    </w:p>
+    <w:p>
+      <w:pPr>
+        <w:pStyle w:val="Heading3"/>
+      </w:pPr>
+      <w:r>
+        <w:t>What Makes a Neighborhood Right for You?</w:t>
       </w:r>
     </w:p>
     <w:p>
       <w:r>
-        <w:t>The Greater Houston area spans multiple counties and offers something for nearly every lifestyle and budget. You'll find:</w:t>
+        <w:t>The Houston area spans hundreds of square miles, each with distinct character, price points, and lifestyle appeal. Before diving into mortgage details, take time to identify what matters most to you:</w:t>
       </w:r>
     </w:p>
     <w:p>
@@ -116,7 +127,7 @@
         <w:pStyle w:val="ListBullet"/>
       </w:pPr>
       <w:r>
-        <w:t>Diverse neighborhoods: From urban townhomes in the Heights and Memorial to sprawling master-planned communities in Pearland and Conroe</w:t>
+        <w:t>Proximity to Work: Commute times in the Houston metro can vary widely. Living in Tomball might mean a different drive than living in Pearland or Bellaire.</w:t>
       </w:r>
     </w:p>
     <w:p>
@@ -124,7 +135,7 @@
         <w:pStyle w:val="ListBullet"/>
       </w:pPr>
       <w:r>
-        <w:t>Strong job market: Energy, healthcare, aerospace, and technology sectors drive economic growth</w:t>
+        <w:t>School Districts: If education is a priority, research the local ISD ratings and feeder patterns. Neighborhoods often rise and fall in appeal based on school performance.</w:t>
       </w:r>
     </w:p>
     <w:p>
@@ -132,7 +143,7 @@
         <w:pStyle w:val="ListBullet"/>
       </w:pPr>
       <w:r>
-        <w:t>No state income tax: Texas residents benefit from lower overall tax burden</w:t>
+        <w:t>Amenities and Lifestyle: Are you seeking master-planned communities with golf courses and resort-style amenities (common in areas like The Woodlands and Sugar Land)? Or do you prefer established, tree-lined neighborhoods with neighborhood parks and local shops?</w:t>
       </w:r>
     </w:p>
     <w:p>
@@ -140,12 +151,53 @@
         <w:pStyle w:val="ListBullet"/>
       </w:pPr>
       <w:r>
-        <w:t>Varied price points: Options exist across multiple price ranges throughout the metro</w:t>
+        <w:t>Price Range: The Houston area offers options from more affordable neighborhoods like Spring and Conroe to premium areas like Memorial, Bellaire, and Magnolia. Your mortgage budget will help narrow this down.</w:t>
+      </w:r>
+    </w:p>
+    <w:p>
+      <w:pPr>
+        <w:pStyle w:val="ListBullet"/>
+      </w:pPr>
+      <w:r>
+        <w:t>Future Growth: Some Houston neighborhoods are experiencing rapid appreciation and development, while others are more stable, established communities.</w:t>
+      </w:r>
+    </w:p>
+    <w:p>
+      <w:pPr>
+        <w:pStyle w:val="Heading3"/>
+      </w:pPr>
+      <w:r>
+        <w:t>Popular Houston Metro Neighborhoods to Consider</w:t>
       </w:r>
     </w:p>
     <w:p>
       <w:r>
-        <w:t>But with so many choices, it's easy to feel overwhelmed. That's where understanding both neighborhoods and financing comes into play.</w:t>
+        <w:t>Cypress and Tomball: These northwest Houston communities are known for newer construction, family-friendly master-planned communities, and strong schools. Both have seen significant growth and appeal to young families and professionals.</w:t>
+      </w:r>
+    </w:p>
+    <w:p>
+      <w:r>
+        <w:t>Sugar Land and Pearland: Located southwest of downtown, these areas are home to large corporate campuses, upscale shopping, and well-regarded school systems. They tend to attract families with higher budgets and established professionals.</w:t>
+      </w:r>
+    </w:p>
+    <w:p>
+      <w:r>
+        <w:t>The Woodlands: This iconic master-planned community north of Houston is synonymous with resort-style living, golf, and premium amenities. It's one of the Houston area's most sought-after neighborhoods and is priced accordingly.</w:t>
+      </w:r>
+    </w:p>
+    <w:p>
+      <w:r>
+        <w:t>Friendswood and League City: Situated south of Houston, these communities offer a more suburban feel with strong school districts and good value compared to some northern neighborhoods.</w:t>
+      </w:r>
+    </w:p>
+    <w:p>
+      <w:r>
+        <w:t>Magnolia and Conroe: Further north and west, these areas appeal to buyers seeking more space, acreage, and a less-dense suburban lifestyle while still having reasonable access to Houston employment centers.</w:t>
+      </w:r>
+    </w:p>
+    <w:p>
+      <w:r>
+        <w:t>Memorial, Heights, and Bellaire: These closer-in neighborhoods offer established trees, historic charm, and shorter commutes to downtown Houston, often at a premium price.</w:t>
       </w:r>
     </w:p>
     <w:p>
@@ -153,7 +205,7 @@
         <w:pStyle w:val="Heading2"/>
       </w:pPr>
       <w:r>
-        <w:t>Exploring Houston-Area Neighborhoods</w:t>
+        <w:t>The Mortgage Landscape: What You Need to Know</w:t>
       </w:r>
     </w:p>
     <w:p>
@@ -161,57 +213,12 @@
         <w:pStyle w:val="Heading3"/>
       </w:pPr>
       <w:r>
-        <w:t>Master-Planned Communities: The Woodlands, Sugar Land &amp; Pearland</w:t>
+        <w:t>Getting Pre-Qualified vs. Pre-Approved</w:t>
       </w:r>
     </w:p>
     <w:p>
       <w:r>
-        <w:t>Master-planned communities like The Woodlands, Sugar Land, and Pearland appeal to families seeking amenities, excellent schools, and planned growth. These areas typically feature:</w:t>
-      </w:r>
-    </w:p>
-    <w:p>
-      <w:pPr>
-        <w:pStyle w:val="ListBullet"/>
-      </w:pPr>
-      <w:r>
-        <w:t>Top-rated school districts (MISD, KIPP, PISD)</w:t>
-      </w:r>
-    </w:p>
-    <w:p>
-      <w:pPr>
-        <w:pStyle w:val="ListBullet"/>
-      </w:pPr>
-      <w:r>
-        <w:t>Extensive parks, trails, and recreation centers</w:t>
-      </w:r>
-    </w:p>
-    <w:p>
-      <w:pPr>
-        <w:pStyle w:val="ListBullet"/>
-      </w:pPr>
-      <w:r>
-        <w:t>Planned commercial and retail districts</w:t>
-      </w:r>
-    </w:p>
-    <w:p>
-      <w:pPr>
-        <w:pStyle w:val="ListBullet"/>
-      </w:pPr>
-      <w:r>
-        <w:t>HOA communities with shared amenities</w:t>
-      </w:r>
-    </w:p>
-    <w:p>
-      <w:pPr>
-        <w:pStyle w:val="ListBullet"/>
-      </w:pPr>
-      <w:r>
-        <w:t>New construction and resale options across multiple price ranges</w:t>
-      </w:r>
-    </w:p>
-    <w:p>
-      <w:r>
-        <w:t>Buyers in these areas often benefit from newer homes with modern systems and finishes, though HOA fees should be factored into your overall housing costs.</w:t>
+        <w:t>Before you start touring homes, understand your financing capacity. A pre-qualification is an informal estimate of what you might be able to borrow. A pre-approval involves a thorough review of your finances, income, credit, and assets, giving you and sellers confidence that you're a serious buyer. Working with a loan officer like Tyler can streamline this process and answer questions specific to your situation.</w:t>
       </w:r>
     </w:p>
     <w:p>
@@ -219,236 +226,12 @@
         <w:pStyle w:val="Heading3"/>
       </w:pPr>
       <w:r>
-        <w:t>Established Inner-Loop &amp; Near-Loop Areas: Heights, Bellaire &amp; Memorial</w:t>
+        <w:t>Conventional Mortgages</w:t>
       </w:r>
     </w:p>
     <w:p>
       <w:r>
-        <w:t>The Heights, Bellaire, and Memorial neighborhoods offer character, walkability, and proximity to downtown Houston. These established areas attract professionals seeking shorter commutes and urban amenities. You'll typically find:</w:t>
-      </w:r>
-    </w:p>
-    <w:p>
-      <w:pPr>
-        <w:pStyle w:val="ListBullet"/>
-      </w:pPr>
-      <w:r>
-        <w:t>Older homes with architectural charm (many built 1920s–1990s)</w:t>
-      </w:r>
-    </w:p>
-    <w:p>
-      <w:pPr>
-        <w:pStyle w:val="ListBullet"/>
-      </w:pPr>
-      <w:r>
-        <w:t>More compact lots compared to suburban communities</w:t>
-      </w:r>
-    </w:p>
-    <w:p>
-      <w:pPr>
-        <w:pStyle w:val="ListBullet"/>
-      </w:pPr>
-      <w:r>
-        <w:t>Walkable shopping, dining, and entertainment districts</w:t>
-      </w:r>
-    </w:p>
-    <w:p>
-      <w:pPr>
-        <w:pStyle w:val="ListBullet"/>
-      </w:pPr>
-      <w:r>
-        <w:t>Lower HOA fees or none at all</w:t>
-      </w:r>
-    </w:p>
-    <w:p>
-      <w:pPr>
-        <w:pStyle w:val="ListBullet"/>
-      </w:pPr>
-      <w:r>
-        <w:t>Growing appreciation and renovation activity</w:t>
-      </w:r>
-    </w:p>
-    <w:p>
-      <w:pPr>
-        <w:pStyle w:val="Heading3"/>
-      </w:pPr>
-      <w:r>
-        <w:t>Suburban Growth Corridors: Tomball, Cypress &amp; Spring</w:t>
-      </w:r>
-    </w:p>
-    <w:p>
-      <w:r>
-        <w:t>North Houston suburbs like Tomball, Cypress, and Spring offer a blend of suburban tranquility and growing commercial development. These areas appeal to families seeking space and affordability while maintaining reasonable commutes. Features include:</w:t>
-      </w:r>
-    </w:p>
-    <w:p>
-      <w:pPr>
-        <w:pStyle w:val="ListBullet"/>
-      </w:pPr>
-      <w:r>
-        <w:t>Larger lots and more square footage per dollar</w:t>
-      </w:r>
-    </w:p>
-    <w:p>
-      <w:pPr>
-        <w:pStyle w:val="ListBullet"/>
-      </w:pPr>
-      <w:r>
-        <w:t>Mix of newer construction and established neighborhoods</w:t>
-      </w:r>
-    </w:p>
-    <w:p>
-      <w:pPr>
-        <w:pStyle w:val="ListBullet"/>
-      </w:pPr>
-      <w:r>
-        <w:t>Expanding job centers and retail</w:t>
-      </w:r>
-    </w:p>
-    <w:p>
-      <w:pPr>
-        <w:pStyle w:val="ListBullet"/>
-      </w:pPr>
-      <w:r>
-        <w:t>Access to quality schools across multiple districts</w:t>
-      </w:r>
-    </w:p>
-    <w:p>
-      <w:pPr>
-        <w:pStyle w:val="ListBullet"/>
-      </w:pPr>
-      <w:r>
-        <w:t>Proximity to recreation and natural areas</w:t>
-      </w:r>
-    </w:p>
-    <w:p>
-      <w:pPr>
-        <w:pStyle w:val="Heading3"/>
-      </w:pPr>
-      <w:r>
-        <w:t>Southwest &amp; Southeast Options: Friendswood, Magnolia &amp; Conroe</w:t>
-      </w:r>
-    </w:p>
-    <w:p>
-      <w:r>
-        <w:t>Further out communities like Friendswood, Magnolia, and Conroe attract buyers willing to trade a slightly longer commute for more land, newer construction, or a quieter lifestyle. Each offers unique appeal—Friendswood for its suburban polish, Magnolia for country living with convenience, and Conroe for growing job opportunities in its own right.</w:t>
-      </w:r>
-    </w:p>
-    <w:p>
-      <w:pPr>
-        <w:pStyle w:val="Heading2"/>
-      </w:pPr>
-      <w:r>
-        <w:t>Key Considerations When Buying in Houston</w:t>
-      </w:r>
-    </w:p>
-    <w:p>
-      <w:pPr>
-        <w:pStyle w:val="Heading3"/>
-      </w:pPr>
-      <w:r>
-        <w:t>Flood Risk &amp; Insurance</w:t>
-      </w:r>
-    </w:p>
-    <w:p>
-      <w:r>
-        <w:t>Houston's climate and history of heavy rainfall make flood awareness essential. Before making an offer:</w:t>
-      </w:r>
-    </w:p>
-    <w:p>
-      <w:pPr>
-        <w:pStyle w:val="ListBullet"/>
-      </w:pPr>
-      <w:r>
-        <w:t>Check FEMA flood maps for the specific property</w:t>
-      </w:r>
-    </w:p>
-    <w:p>
-      <w:pPr>
-        <w:pStyle w:val="ListBullet"/>
-      </w:pPr>
-      <w:r>
-        <w:t>Understand whether flood insurance is required by your lender</w:t>
-      </w:r>
-    </w:p>
-    <w:p>
-      <w:pPr>
-        <w:pStyle w:val="ListBullet"/>
-      </w:pPr>
-      <w:r>
-        <w:t>Ask the seller about any past flood history</w:t>
-      </w:r>
-    </w:p>
-    <w:p>
-      <w:pPr>
-        <w:pStyle w:val="ListBullet"/>
-      </w:pPr>
-      <w:r>
-        <w:t>Budget for flood insurance if the property is in a flood zone</w:t>
-      </w:r>
-    </w:p>
-    <w:p>
-      <w:pPr>
-        <w:pStyle w:val="Heading3"/>
-      </w:pPr>
-      <w:r>
-        <w:t>School Districts</w:t>
-      </w:r>
-    </w:p>
-    <w:p>
-      <w:r>
-        <w:t>School quality often drives neighborhood values and family decisions. Research district ratings, attendance boundaries, and long-term district outlook. Houston is served by numerous independent school districts with varying reputations and resources.</w:t>
-      </w:r>
-    </w:p>
-    <w:p>
-      <w:pPr>
-        <w:pStyle w:val="Heading3"/>
-      </w:pPr>
-      <w:r>
-        <w:t>Commute &amp; Traffic Patterns</w:t>
-      </w:r>
-    </w:p>
-    <w:p>
-      <w:r>
-        <w:t>Houston's sprawling layout means commute times matter. Use tools like Google Maps to check rush-hour travel times to your workplace, and factor in tolls if you'll use Harris County toll roads.</w:t>
-      </w:r>
-    </w:p>
-    <w:p>
-      <w:pPr>
-        <w:pStyle w:val="Heading3"/>
-      </w:pPr>
-      <w:r>
-        <w:t>HOA &amp; Community Rules</w:t>
-      </w:r>
-    </w:p>
-    <w:p>
-      <w:r>
-        <w:t>Many Houston neighborhoods, especially newer master-planned areas, operate under HOA governance. Review HOA documents, fee structures, and rules before committing.</w:t>
-      </w:r>
-    </w:p>
-    <w:p>
-      <w:pPr>
-        <w:pStyle w:val="Heading2"/>
-      </w:pPr>
-      <w:r>
-        <w:t>Understanding Your Mortgage Options</w:t>
-      </w:r>
-    </w:p>
-    <w:p>
-      <w:r>
-        <w:t>Once you've identified neighborhoods that appeal to you, securing the right financing is critical. The Houston metro's size and diversity mean lenders offer a range of loan products to suit different financial situations.</w:t>
-      </w:r>
-    </w:p>
-    <w:p>
-      <w:pPr>
-        <w:pStyle w:val="Heading3"/>
-      </w:pPr>
-      <w:r>
-        <w:t>Conventional Loans</w:t>
-      </w:r>
-    </w:p>
-    <w:p>
-      <w:r>
-        <w:t>Conventional mortgages are popular for borrowers with solid credit and down payment capacity. These loans typically offer competitive terms and may allow for lower down payments when paired with mortgage insurance. Conventional loans are available across the Houston metro for both primary residences and investment properties.</w:t>
+        <w:t>Conventional loans are the most common mortgage type and typically require a minimum credit score and down payment. They offer flexibility in loan terms and are ideal for buyers with stable employment, good credit, and a down payment of 3% to 20% or more. Many Houston-area homebuyers use conventional financing because of the variety of options and competitive terms available.</w:t>
       </w:r>
     </w:p>
     <w:p>
@@ -461,7 +244,7 @@
     </w:p>
     <w:p>
       <w:r>
-        <w:t>FHA loans are a popular option for first-time homebuyers and those with lower down payments or credit challenges. FHA loans allow down payments as low as 3.5% and may work for borrowers with recent credit events. Keep in mind that FHA loans include mortgage insurance premiums, and most FHA loans closed after 2013 with less than 10% down carry mortgage insurance for the life of the loan.</w:t>
+        <w:t>FHA loans are backed by the Federal Housing Administration and are designed to help buyers with lower credit scores or limited down payments. They allow down payments as low as 3.5% and can be more flexible with debt-to-income ratios than conventional loans. FHA mortgages include mortgage insurance premiums (MIP), which protect the lender if you default.</w:t>
       </w:r>
     </w:p>
     <w:p>
@@ -469,12 +252,12 @@
         <w:pStyle w:val="Heading3"/>
       </w:pPr>
       <w:r>
-        <w:t>VA &amp; USDA Loans</w:t>
+        <w:t>VA and USDA Loans</w:t>
       </w:r>
     </w:p>
     <w:p>
       <w:r>
-        <w:t>Military veterans throughout the Houston area may qualify for VA loans, which offer favorable terms and no down payment requirement. USDA loans serve eligible rural and suburban areas around Houston for qualified borrowers seeking to purchase a primary residence.</w:t>
+        <w:t>If you're a veteran or active-duty service member, you may qualify for a VA loan, which often requires no down payment and has no mortgage insurance requirement. USDA loans serve eligible buyers in rural areas and suburban communities within the Houston metro and are another no-down-payment option for qualified borrowers.</w:t>
       </w:r>
     </w:p>
     <w:p>
@@ -482,12 +265,12 @@
         <w:pStyle w:val="Heading3"/>
       </w:pPr>
       <w:r>
-        <w:t>Construction &amp; New Build Financing</w:t>
+        <w:t>Understanding Debt-to-Income Ratios</w:t>
       </w:r>
     </w:p>
     <w:p>
       <w:r>
-        <w:t>Buying new construction in communities like Sugar Land, The Woodlands, or Pearland often involves construction financing. CMG Home Loans offers conventional construction products that use a two-stage closing process, allowing you to lock in financing terms before your home is complete.</w:t>
+        <w:t>Lenders use debt-to-income (DTI) ratios to assess your ability to manage a mortgage payment alongside other debts. Generally, conventional loans work around 43–50% DTI, depending on the lender's automated underwriting system. If your DTI is higher or your situation is non-traditional, alternative loan programs may be available. Tyler can explain how your specific financial picture affects your borrowing capacity.</w:t>
       </w:r>
     </w:p>
     <w:p>
@@ -495,12 +278,12 @@
         <w:pStyle w:val="Heading3"/>
       </w:pPr>
       <w:r>
-        <w:t>Home Equity Products for Current Homeowners</w:t>
+        <w:t>Fixed-Rate vs. Adjustable-Rate Mortgages</w:t>
       </w:r>
     </w:p>
     <w:p>
       <w:r>
-        <w:t>If you already own a home in the Houston area and want to access equity for home improvements, debt consolidation, or other purposes, home equity options may be available depending on your situation and local regulations. Texas home equity rules include important protections like a 12-day cooling-off period and specific LTV limits for cash-out scenarios.</w:t>
+        <w:t>Most Houston homebuyers choose fixed-rate mortgages, where your interest rate and payment remain the same for the life of the loan. Adjustable-rate mortgages (ARMs) have rates that can change after an initial period, which can mean lower initial payments but future uncertainty. For stability and long-term planning, many homebuyers prefer the predictability of a fixed rate.</w:t>
       </w:r>
     </w:p>
     <w:p>
@@ -508,17 +291,99 @@
         <w:pStyle w:val="Heading2"/>
       </w:pPr>
       <w:r>
-        <w:t>Working With a Mortgage Professional</w:t>
+        <w:t>The Role of a Loan Officer in Your Home Purchase</w:t>
       </w:r>
     </w:p>
     <w:p>
       <w:r>
-        <w:t>Navigating neighborhoods and loan products is easier with expert guidance. Tyler Henschel, a Senior Loan Officer at CMG Home Loans, serves homebuyers and investors throughout the Greater Houston area—including Tomball, Cypress, Sugar Land, The Woodlands, Pearland, Spring, Magnolia, Conroe, Friendswood, Memorial, Heights, Bellaire, and beyond.</w:t>
+        <w:t>Navigating mortgage options can feel overwhelming. That's where a knowledgeable loan officer comes in. They can help you understand which loan products align with your financial situation, explain the costs and terms involved, and guide you through the application and underwriting process.</w:t>
       </w:r>
     </w:p>
     <w:p>
       <w:r>
-        <w:t>Tyler can help you understand your financing options, discuss your specific situation, and connect you with loan products that align with your goals. Whether you're a first-time buyer exploring The Woodlands or an experienced investor looking at rental properties near Conroe</w:t>
+        <w:t>Tyler Henschel at CMG Home Loans brings years of experience serving homebuyers across the Houston metropolitan area—from Friendswood to Magnolia, Bellaire to Spring, and everywhere in between. He can answer your questions, explain different mortgage products, and help you make an informed decision about financing your home purchase.</w:t>
+      </w:r>
+    </w:p>
+    <w:p>
+      <w:pPr>
+        <w:pStyle w:val="Heading2"/>
+      </w:pPr>
+      <w:r>
+        <w:t>Key Takeaways for Houston Metro Homebuyers</w:t>
+      </w:r>
+    </w:p>
+    <w:p>
+      <w:pPr>
+        <w:pStyle w:val="ListBullet"/>
+      </w:pPr>
+      <w:r>
+        <w:t>Evaluate neighborhoods based on commute, schools, amenities, price range, and growth potential.</w:t>
+      </w:r>
+    </w:p>
+    <w:p>
+      <w:pPr>
+        <w:pStyle w:val="ListBullet"/>
+      </w:pPr>
+      <w:r>
+        <w:t>The Houston area offers diverse communities, each with distinct character and appeal.</w:t>
+      </w:r>
+    </w:p>
+    <w:p>
+      <w:pPr>
+        <w:pStyle w:val="ListBullet"/>
+      </w:pPr>
+      <w:r>
+        <w:t>Work with a loan officer early to understand your financing options and borrowing capacity.</w:t>
+      </w:r>
+    </w:p>
+    <w:p>
+      <w:pPr>
+        <w:pStyle w:val="ListBullet"/>
+      </w:pPr>
+      <w:r>
+        <w:t>Multiple mortgage products—conventional, FHA, VA, and USDA—serve different borrower needs.</w:t>
+      </w:r>
+    </w:p>
+    <w:p>
+      <w:pPr>
+        <w:pStyle w:val="ListBullet"/>
+      </w:pPr>
+      <w:r>
+        <w:t>Debt-to-income ratios, credit, and down payment all influence loan eligibility and terms.</w:t>
+      </w:r>
+    </w:p>
+    <w:p>
+      <w:pPr>
+        <w:pStyle w:val="ListBullet"/>
+      </w:pPr>
+      <w:r>
+        <w:t>Fixed-rate mortgages offer stability and predictability over the life of the loan.</w:t>
+      </w:r>
+    </w:p>
+    <w:p>
+      <w:pPr>
+        <w:pStyle w:val="Heading2"/>
+      </w:pPr>
+      <w:r>
+        <w:t>Ready to Start Your Houston Metro Home Search?</w:t>
+      </w:r>
+    </w:p>
+    <w:p>
+      <w:r>
+        <w:t>Buying a home is one of the biggest decisions you'll make. Whether you're looking to settle in Cypress, Katy, The Woodlands, Sugar Land, Tomball, Pearland, Conroe, or any other Houston neighborhood, having the right mortgage guidance matters. Tyler Henschel at CMG Home Loans is ready to discuss your financing options and help you move forward with confidence.</w:t>
+      </w:r>
+    </w:p>
+    <w:p>
+      <w:r>
+        <w:t>Contact Tyler today to schedule a consultation:</w:t>
+      </w:r>
+    </w:p>
+    <w:p>
+      <w:pPr>
+        <w:pStyle w:val="ListBullet"/>
+      </w:pPr>
+      <w:r>
+        <w:t>Phone:</w:t>
       </w:r>
     </w:p>
     <w:sectPr>

</xml_diff>